<commit_message>
Make header_row_repeat fixture deterministic
The earlier fixture left the table in autofit mode, so Word and Morph
disagreed on column widths (Word measured content; Morph used the
explicit grid). Switch to fixed layout with weighted columns
(ID 1500 / Name 3000 / Notes 4500 twips) so both engines render the
same column geometry and the scenario stays focused on its intended
behaviour: header row repeating after page breaks.

Both engines still split the table across 3 pages with the bold
header repeating on pages 2 and 3 — the row-density mismatch that
remains is an unrelated cell-padding / font-metric difference and
is out of scope for this scenario.

Co-Authored-By: Claude Opus 4.7 (1M context) <noreply@anthropic.com>
</commit_message>
<xml_diff>
--- a/src/Tests/Inputs/header_row_repeat/01/input.docx
+++ b/src/Tests/Inputs/header_row_repeat/01/input.docx
@@ -5,6 +5,7 @@
     <w:tbl>
       <w:tblPr>
         <w:tblW w:w="9000" w:type="dxa"/>
+        <w:tblLayout w:type="fixed"/>
         <w:tblBorders>
           <w:top w:val="single" w:color="000000" w:sz="4"/>
           <w:bottom w:val="single" w:color="000000" w:sz="4"/>
@@ -15,9 +16,9 @@
         </w:tblBorders>
       </w:tblPr>
       <w:tblGrid>
+        <w:gridCol w:w="1500"/>
         <w:gridCol w:w="3000"/>
-        <w:gridCol w:w="3000"/>
-        <w:gridCol w:w="3000"/>
+        <w:gridCol w:w="4500"/>
       </w:tblGrid>
       <w:tr>
         <w:trPr>
@@ -25,7 +26,7 @@
         </w:trPr>
         <w:tc>
           <w:tcPr>
-            <w:tcW w:w="3000" w:type="dxa"/>
+            <w:tcW w:w="1500" w:type="dxa"/>
           </w:tcPr>
           <w:p>
             <w:r>
@@ -51,7 +52,7 @@
         </w:tc>
         <w:tc>
           <w:tcPr>
-            <w:tcW w:w="3000" w:type="dxa"/>
+            <w:tcW w:w="4500" w:type="dxa"/>
           </w:tcPr>
           <w:p>
             <w:r>
@@ -66,7 +67,7 @@
       <w:tr>
         <w:tc>
           <w:tcPr>
-            <w:tcW w:w="3000" w:type="dxa"/>
+            <w:tcW w:w="1500" w:type="dxa"/>
           </w:tcPr>
           <w:p>
             <w:r>
@@ -86,19 +87,19 @@
         </w:tc>
         <w:tc>
           <w:tcPr>
-            <w:tcW w:w="3000" w:type="dxa"/>
-          </w:tcPr>
-          <w:p>
-            <w:r>
-              <w:t>Lorem ipsum dolor sit amet</w:t>
-            </w:r>
-          </w:p>
-        </w:tc>
-      </w:tr>
-      <w:tr>
-        <w:tc>
-          <w:tcPr>
-            <w:tcW w:w="3000" w:type="dxa"/>
+            <w:tcW w:w="4500" w:type="dxa"/>
+          </w:tcPr>
+          <w:p>
+            <w:r>
+              <w:t>Lorem ipsum dolor sit amet</w:t>
+            </w:r>
+          </w:p>
+        </w:tc>
+      </w:tr>
+      <w:tr>
+        <w:tc>
+          <w:tcPr>
+            <w:tcW w:w="1500" w:type="dxa"/>
           </w:tcPr>
           <w:p>
             <w:r>
@@ -118,19 +119,19 @@
         </w:tc>
         <w:tc>
           <w:tcPr>
-            <w:tcW w:w="3000" w:type="dxa"/>
-          </w:tcPr>
-          <w:p>
-            <w:r>
-              <w:t>Lorem ipsum dolor sit amet</w:t>
-            </w:r>
-          </w:p>
-        </w:tc>
-      </w:tr>
-      <w:tr>
-        <w:tc>
-          <w:tcPr>
-            <w:tcW w:w="3000" w:type="dxa"/>
+            <w:tcW w:w="4500" w:type="dxa"/>
+          </w:tcPr>
+          <w:p>
+            <w:r>
+              <w:t>Lorem ipsum dolor sit amet</w:t>
+            </w:r>
+          </w:p>
+        </w:tc>
+      </w:tr>
+      <w:tr>
+        <w:tc>
+          <w:tcPr>
+            <w:tcW w:w="1500" w:type="dxa"/>
           </w:tcPr>
           <w:p>
             <w:r>
@@ -150,19 +151,19 @@
         </w:tc>
         <w:tc>
           <w:tcPr>
-            <w:tcW w:w="3000" w:type="dxa"/>
-          </w:tcPr>
-          <w:p>
-            <w:r>
-              <w:t>Lorem ipsum dolor sit amet</w:t>
-            </w:r>
-          </w:p>
-        </w:tc>
-      </w:tr>
-      <w:tr>
-        <w:tc>
-          <w:tcPr>
-            <w:tcW w:w="3000" w:type="dxa"/>
+            <w:tcW w:w="4500" w:type="dxa"/>
+          </w:tcPr>
+          <w:p>
+            <w:r>
+              <w:t>Lorem ipsum dolor sit amet</w:t>
+            </w:r>
+          </w:p>
+        </w:tc>
+      </w:tr>
+      <w:tr>
+        <w:tc>
+          <w:tcPr>
+            <w:tcW w:w="1500" w:type="dxa"/>
           </w:tcPr>
           <w:p>
             <w:r>
@@ -182,19 +183,19 @@
         </w:tc>
         <w:tc>
           <w:tcPr>
-            <w:tcW w:w="3000" w:type="dxa"/>
-          </w:tcPr>
-          <w:p>
-            <w:r>
-              <w:t>Lorem ipsum dolor sit amet</w:t>
-            </w:r>
-          </w:p>
-        </w:tc>
-      </w:tr>
-      <w:tr>
-        <w:tc>
-          <w:tcPr>
-            <w:tcW w:w="3000" w:type="dxa"/>
+            <w:tcW w:w="4500" w:type="dxa"/>
+          </w:tcPr>
+          <w:p>
+            <w:r>
+              <w:t>Lorem ipsum dolor sit amet</w:t>
+            </w:r>
+          </w:p>
+        </w:tc>
+      </w:tr>
+      <w:tr>
+        <w:tc>
+          <w:tcPr>
+            <w:tcW w:w="1500" w:type="dxa"/>
           </w:tcPr>
           <w:p>
             <w:r>
@@ -214,19 +215,19 @@
         </w:tc>
         <w:tc>
           <w:tcPr>
-            <w:tcW w:w="3000" w:type="dxa"/>
-          </w:tcPr>
-          <w:p>
-            <w:r>
-              <w:t>Lorem ipsum dolor sit amet</w:t>
-            </w:r>
-          </w:p>
-        </w:tc>
-      </w:tr>
-      <w:tr>
-        <w:tc>
-          <w:tcPr>
-            <w:tcW w:w="3000" w:type="dxa"/>
+            <w:tcW w:w="4500" w:type="dxa"/>
+          </w:tcPr>
+          <w:p>
+            <w:r>
+              <w:t>Lorem ipsum dolor sit amet</w:t>
+            </w:r>
+          </w:p>
+        </w:tc>
+      </w:tr>
+      <w:tr>
+        <w:tc>
+          <w:tcPr>
+            <w:tcW w:w="1500" w:type="dxa"/>
           </w:tcPr>
           <w:p>
             <w:r>
@@ -246,19 +247,19 @@
         </w:tc>
         <w:tc>
           <w:tcPr>
-            <w:tcW w:w="3000" w:type="dxa"/>
-          </w:tcPr>
-          <w:p>
-            <w:r>
-              <w:t>Lorem ipsum dolor sit amet</w:t>
-            </w:r>
-          </w:p>
-        </w:tc>
-      </w:tr>
-      <w:tr>
-        <w:tc>
-          <w:tcPr>
-            <w:tcW w:w="3000" w:type="dxa"/>
+            <w:tcW w:w="4500" w:type="dxa"/>
+          </w:tcPr>
+          <w:p>
+            <w:r>
+              <w:t>Lorem ipsum dolor sit amet</w:t>
+            </w:r>
+          </w:p>
+        </w:tc>
+      </w:tr>
+      <w:tr>
+        <w:tc>
+          <w:tcPr>
+            <w:tcW w:w="1500" w:type="dxa"/>
           </w:tcPr>
           <w:p>
             <w:r>
@@ -278,19 +279,19 @@
         </w:tc>
         <w:tc>
           <w:tcPr>
-            <w:tcW w:w="3000" w:type="dxa"/>
-          </w:tcPr>
-          <w:p>
-            <w:r>
-              <w:t>Lorem ipsum dolor sit amet</w:t>
-            </w:r>
-          </w:p>
-        </w:tc>
-      </w:tr>
-      <w:tr>
-        <w:tc>
-          <w:tcPr>
-            <w:tcW w:w="3000" w:type="dxa"/>
+            <w:tcW w:w="4500" w:type="dxa"/>
+          </w:tcPr>
+          <w:p>
+            <w:r>
+              <w:t>Lorem ipsum dolor sit amet</w:t>
+            </w:r>
+          </w:p>
+        </w:tc>
+      </w:tr>
+      <w:tr>
+        <w:tc>
+          <w:tcPr>
+            <w:tcW w:w="1500" w:type="dxa"/>
           </w:tcPr>
           <w:p>
             <w:r>
@@ -310,19 +311,19 @@
         </w:tc>
         <w:tc>
           <w:tcPr>
-            <w:tcW w:w="3000" w:type="dxa"/>
-          </w:tcPr>
-          <w:p>
-            <w:r>
-              <w:t>Lorem ipsum dolor sit amet</w:t>
-            </w:r>
-          </w:p>
-        </w:tc>
-      </w:tr>
-      <w:tr>
-        <w:tc>
-          <w:tcPr>
-            <w:tcW w:w="3000" w:type="dxa"/>
+            <w:tcW w:w="4500" w:type="dxa"/>
+          </w:tcPr>
+          <w:p>
+            <w:r>
+              <w:t>Lorem ipsum dolor sit amet</w:t>
+            </w:r>
+          </w:p>
+        </w:tc>
+      </w:tr>
+      <w:tr>
+        <w:tc>
+          <w:tcPr>
+            <w:tcW w:w="1500" w:type="dxa"/>
           </w:tcPr>
           <w:p>
             <w:r>
@@ -342,19 +343,19 @@
         </w:tc>
         <w:tc>
           <w:tcPr>
-            <w:tcW w:w="3000" w:type="dxa"/>
-          </w:tcPr>
-          <w:p>
-            <w:r>
-              <w:t>Lorem ipsum dolor sit amet</w:t>
-            </w:r>
-          </w:p>
-        </w:tc>
-      </w:tr>
-      <w:tr>
-        <w:tc>
-          <w:tcPr>
-            <w:tcW w:w="3000" w:type="dxa"/>
+            <w:tcW w:w="4500" w:type="dxa"/>
+          </w:tcPr>
+          <w:p>
+            <w:r>
+              <w:t>Lorem ipsum dolor sit amet</w:t>
+            </w:r>
+          </w:p>
+        </w:tc>
+      </w:tr>
+      <w:tr>
+        <w:tc>
+          <w:tcPr>
+            <w:tcW w:w="1500" w:type="dxa"/>
           </w:tcPr>
           <w:p>
             <w:r>
@@ -374,19 +375,19 @@
         </w:tc>
         <w:tc>
           <w:tcPr>
-            <w:tcW w:w="3000" w:type="dxa"/>
-          </w:tcPr>
-          <w:p>
-            <w:r>
-              <w:t>Lorem ipsum dolor sit amet</w:t>
-            </w:r>
-          </w:p>
-        </w:tc>
-      </w:tr>
-      <w:tr>
-        <w:tc>
-          <w:tcPr>
-            <w:tcW w:w="3000" w:type="dxa"/>
+            <w:tcW w:w="4500" w:type="dxa"/>
+          </w:tcPr>
+          <w:p>
+            <w:r>
+              <w:t>Lorem ipsum dolor sit amet</w:t>
+            </w:r>
+          </w:p>
+        </w:tc>
+      </w:tr>
+      <w:tr>
+        <w:tc>
+          <w:tcPr>
+            <w:tcW w:w="1500" w:type="dxa"/>
           </w:tcPr>
           <w:p>
             <w:r>
@@ -406,19 +407,19 @@
         </w:tc>
         <w:tc>
           <w:tcPr>
-            <w:tcW w:w="3000" w:type="dxa"/>
-          </w:tcPr>
-          <w:p>
-            <w:r>
-              <w:t>Lorem ipsum dolor sit amet</w:t>
-            </w:r>
-          </w:p>
-        </w:tc>
-      </w:tr>
-      <w:tr>
-        <w:tc>
-          <w:tcPr>
-            <w:tcW w:w="3000" w:type="dxa"/>
+            <w:tcW w:w="4500" w:type="dxa"/>
+          </w:tcPr>
+          <w:p>
+            <w:r>
+              <w:t>Lorem ipsum dolor sit amet</w:t>
+            </w:r>
+          </w:p>
+        </w:tc>
+      </w:tr>
+      <w:tr>
+        <w:tc>
+          <w:tcPr>
+            <w:tcW w:w="1500" w:type="dxa"/>
           </w:tcPr>
           <w:p>
             <w:r>
@@ -438,19 +439,19 @@
         </w:tc>
         <w:tc>
           <w:tcPr>
-            <w:tcW w:w="3000" w:type="dxa"/>
-          </w:tcPr>
-          <w:p>
-            <w:r>
-              <w:t>Lorem ipsum dolor sit amet</w:t>
-            </w:r>
-          </w:p>
-        </w:tc>
-      </w:tr>
-      <w:tr>
-        <w:tc>
-          <w:tcPr>
-            <w:tcW w:w="3000" w:type="dxa"/>
+            <w:tcW w:w="4500" w:type="dxa"/>
+          </w:tcPr>
+          <w:p>
+            <w:r>
+              <w:t>Lorem ipsum dolor sit amet</w:t>
+            </w:r>
+          </w:p>
+        </w:tc>
+      </w:tr>
+      <w:tr>
+        <w:tc>
+          <w:tcPr>
+            <w:tcW w:w="1500" w:type="dxa"/>
           </w:tcPr>
           <w:p>
             <w:r>
@@ -470,19 +471,19 @@
         </w:tc>
         <w:tc>
           <w:tcPr>
-            <w:tcW w:w="3000" w:type="dxa"/>
-          </w:tcPr>
-          <w:p>
-            <w:r>
-              <w:t>Lorem ipsum dolor sit amet</w:t>
-            </w:r>
-          </w:p>
-        </w:tc>
-      </w:tr>
-      <w:tr>
-        <w:tc>
-          <w:tcPr>
-            <w:tcW w:w="3000" w:type="dxa"/>
+            <w:tcW w:w="4500" w:type="dxa"/>
+          </w:tcPr>
+          <w:p>
+            <w:r>
+              <w:t>Lorem ipsum dolor sit amet</w:t>
+            </w:r>
+          </w:p>
+        </w:tc>
+      </w:tr>
+      <w:tr>
+        <w:tc>
+          <w:tcPr>
+            <w:tcW w:w="1500" w:type="dxa"/>
           </w:tcPr>
           <w:p>
             <w:r>
@@ -502,19 +503,19 @@
         </w:tc>
         <w:tc>
           <w:tcPr>
-            <w:tcW w:w="3000" w:type="dxa"/>
-          </w:tcPr>
-          <w:p>
-            <w:r>
-              <w:t>Lorem ipsum dolor sit amet</w:t>
-            </w:r>
-          </w:p>
-        </w:tc>
-      </w:tr>
-      <w:tr>
-        <w:tc>
-          <w:tcPr>
-            <w:tcW w:w="3000" w:type="dxa"/>
+            <w:tcW w:w="4500" w:type="dxa"/>
+          </w:tcPr>
+          <w:p>
+            <w:r>
+              <w:t>Lorem ipsum dolor sit amet</w:t>
+            </w:r>
+          </w:p>
+        </w:tc>
+      </w:tr>
+      <w:tr>
+        <w:tc>
+          <w:tcPr>
+            <w:tcW w:w="1500" w:type="dxa"/>
           </w:tcPr>
           <w:p>
             <w:r>
@@ -534,19 +535,19 @@
         </w:tc>
         <w:tc>
           <w:tcPr>
-            <w:tcW w:w="3000" w:type="dxa"/>
-          </w:tcPr>
-          <w:p>
-            <w:r>
-              <w:t>Lorem ipsum dolor sit amet</w:t>
-            </w:r>
-          </w:p>
-        </w:tc>
-      </w:tr>
-      <w:tr>
-        <w:tc>
-          <w:tcPr>
-            <w:tcW w:w="3000" w:type="dxa"/>
+            <w:tcW w:w="4500" w:type="dxa"/>
+          </w:tcPr>
+          <w:p>
+            <w:r>
+              <w:t>Lorem ipsum dolor sit amet</w:t>
+            </w:r>
+          </w:p>
+        </w:tc>
+      </w:tr>
+      <w:tr>
+        <w:tc>
+          <w:tcPr>
+            <w:tcW w:w="1500" w:type="dxa"/>
           </w:tcPr>
           <w:p>
             <w:r>
@@ -566,19 +567,19 @@
         </w:tc>
         <w:tc>
           <w:tcPr>
-            <w:tcW w:w="3000" w:type="dxa"/>
-          </w:tcPr>
-          <w:p>
-            <w:r>
-              <w:t>Lorem ipsum dolor sit amet</w:t>
-            </w:r>
-          </w:p>
-        </w:tc>
-      </w:tr>
-      <w:tr>
-        <w:tc>
-          <w:tcPr>
-            <w:tcW w:w="3000" w:type="dxa"/>
+            <w:tcW w:w="4500" w:type="dxa"/>
+          </w:tcPr>
+          <w:p>
+            <w:r>
+              <w:t>Lorem ipsum dolor sit amet</w:t>
+            </w:r>
+          </w:p>
+        </w:tc>
+      </w:tr>
+      <w:tr>
+        <w:tc>
+          <w:tcPr>
+            <w:tcW w:w="1500" w:type="dxa"/>
           </w:tcPr>
           <w:p>
             <w:r>
@@ -598,19 +599,19 @@
         </w:tc>
         <w:tc>
           <w:tcPr>
-            <w:tcW w:w="3000" w:type="dxa"/>
-          </w:tcPr>
-          <w:p>
-            <w:r>
-              <w:t>Lorem ipsum dolor sit amet</w:t>
-            </w:r>
-          </w:p>
-        </w:tc>
-      </w:tr>
-      <w:tr>
-        <w:tc>
-          <w:tcPr>
-            <w:tcW w:w="3000" w:type="dxa"/>
+            <w:tcW w:w="4500" w:type="dxa"/>
+          </w:tcPr>
+          <w:p>
+            <w:r>
+              <w:t>Lorem ipsum dolor sit amet</w:t>
+            </w:r>
+          </w:p>
+        </w:tc>
+      </w:tr>
+      <w:tr>
+        <w:tc>
+          <w:tcPr>
+            <w:tcW w:w="1500" w:type="dxa"/>
           </w:tcPr>
           <w:p>
             <w:r>
@@ -630,19 +631,19 @@
         </w:tc>
         <w:tc>
           <w:tcPr>
-            <w:tcW w:w="3000" w:type="dxa"/>
-          </w:tcPr>
-          <w:p>
-            <w:r>
-              <w:t>Lorem ipsum dolor sit amet</w:t>
-            </w:r>
-          </w:p>
-        </w:tc>
-      </w:tr>
-      <w:tr>
-        <w:tc>
-          <w:tcPr>
-            <w:tcW w:w="3000" w:type="dxa"/>
+            <w:tcW w:w="4500" w:type="dxa"/>
+          </w:tcPr>
+          <w:p>
+            <w:r>
+              <w:t>Lorem ipsum dolor sit amet</w:t>
+            </w:r>
+          </w:p>
+        </w:tc>
+      </w:tr>
+      <w:tr>
+        <w:tc>
+          <w:tcPr>
+            <w:tcW w:w="1500" w:type="dxa"/>
           </w:tcPr>
           <w:p>
             <w:r>
@@ -662,19 +663,19 @@
         </w:tc>
         <w:tc>
           <w:tcPr>
-            <w:tcW w:w="3000" w:type="dxa"/>
-          </w:tcPr>
-          <w:p>
-            <w:r>
-              <w:t>Lorem ipsum dolor sit amet</w:t>
-            </w:r>
-          </w:p>
-        </w:tc>
-      </w:tr>
-      <w:tr>
-        <w:tc>
-          <w:tcPr>
-            <w:tcW w:w="3000" w:type="dxa"/>
+            <w:tcW w:w="4500" w:type="dxa"/>
+          </w:tcPr>
+          <w:p>
+            <w:r>
+              <w:t>Lorem ipsum dolor sit amet</w:t>
+            </w:r>
+          </w:p>
+        </w:tc>
+      </w:tr>
+      <w:tr>
+        <w:tc>
+          <w:tcPr>
+            <w:tcW w:w="1500" w:type="dxa"/>
           </w:tcPr>
           <w:p>
             <w:r>
@@ -694,19 +695,19 @@
         </w:tc>
         <w:tc>
           <w:tcPr>
-            <w:tcW w:w="3000" w:type="dxa"/>
-          </w:tcPr>
-          <w:p>
-            <w:r>
-              <w:t>Lorem ipsum dolor sit amet</w:t>
-            </w:r>
-          </w:p>
-        </w:tc>
-      </w:tr>
-      <w:tr>
-        <w:tc>
-          <w:tcPr>
-            <w:tcW w:w="3000" w:type="dxa"/>
+            <w:tcW w:w="4500" w:type="dxa"/>
+          </w:tcPr>
+          <w:p>
+            <w:r>
+              <w:t>Lorem ipsum dolor sit amet</w:t>
+            </w:r>
+          </w:p>
+        </w:tc>
+      </w:tr>
+      <w:tr>
+        <w:tc>
+          <w:tcPr>
+            <w:tcW w:w="1500" w:type="dxa"/>
           </w:tcPr>
           <w:p>
             <w:r>
@@ -726,19 +727,19 @@
         </w:tc>
         <w:tc>
           <w:tcPr>
-            <w:tcW w:w="3000" w:type="dxa"/>
-          </w:tcPr>
-          <w:p>
-            <w:r>
-              <w:t>Lorem ipsum dolor sit amet</w:t>
-            </w:r>
-          </w:p>
-        </w:tc>
-      </w:tr>
-      <w:tr>
-        <w:tc>
-          <w:tcPr>
-            <w:tcW w:w="3000" w:type="dxa"/>
+            <w:tcW w:w="4500" w:type="dxa"/>
+          </w:tcPr>
+          <w:p>
+            <w:r>
+              <w:t>Lorem ipsum dolor sit amet</w:t>
+            </w:r>
+          </w:p>
+        </w:tc>
+      </w:tr>
+      <w:tr>
+        <w:tc>
+          <w:tcPr>
+            <w:tcW w:w="1500" w:type="dxa"/>
           </w:tcPr>
           <w:p>
             <w:r>
@@ -758,19 +759,19 @@
         </w:tc>
         <w:tc>
           <w:tcPr>
-            <w:tcW w:w="3000" w:type="dxa"/>
-          </w:tcPr>
-          <w:p>
-            <w:r>
-              <w:t>Lorem ipsum dolor sit amet</w:t>
-            </w:r>
-          </w:p>
-        </w:tc>
-      </w:tr>
-      <w:tr>
-        <w:tc>
-          <w:tcPr>
-            <w:tcW w:w="3000" w:type="dxa"/>
+            <w:tcW w:w="4500" w:type="dxa"/>
+          </w:tcPr>
+          <w:p>
+            <w:r>
+              <w:t>Lorem ipsum dolor sit amet</w:t>
+            </w:r>
+          </w:p>
+        </w:tc>
+      </w:tr>
+      <w:tr>
+        <w:tc>
+          <w:tcPr>
+            <w:tcW w:w="1500" w:type="dxa"/>
           </w:tcPr>
           <w:p>
             <w:r>
@@ -790,19 +791,19 @@
         </w:tc>
         <w:tc>
           <w:tcPr>
-            <w:tcW w:w="3000" w:type="dxa"/>
-          </w:tcPr>
-          <w:p>
-            <w:r>
-              <w:t>Lorem ipsum dolor sit amet</w:t>
-            </w:r>
-          </w:p>
-        </w:tc>
-      </w:tr>
-      <w:tr>
-        <w:tc>
-          <w:tcPr>
-            <w:tcW w:w="3000" w:type="dxa"/>
+            <w:tcW w:w="4500" w:type="dxa"/>
+          </w:tcPr>
+          <w:p>
+            <w:r>
+              <w:t>Lorem ipsum dolor sit amet</w:t>
+            </w:r>
+          </w:p>
+        </w:tc>
+      </w:tr>
+      <w:tr>
+        <w:tc>
+          <w:tcPr>
+            <w:tcW w:w="1500" w:type="dxa"/>
           </w:tcPr>
           <w:p>
             <w:r>
@@ -822,19 +823,19 @@
         </w:tc>
         <w:tc>
           <w:tcPr>
-            <w:tcW w:w="3000" w:type="dxa"/>
-          </w:tcPr>
-          <w:p>
-            <w:r>
-              <w:t>Lorem ipsum dolor sit amet</w:t>
-            </w:r>
-          </w:p>
-        </w:tc>
-      </w:tr>
-      <w:tr>
-        <w:tc>
-          <w:tcPr>
-            <w:tcW w:w="3000" w:type="dxa"/>
+            <w:tcW w:w="4500" w:type="dxa"/>
+          </w:tcPr>
+          <w:p>
+            <w:r>
+              <w:t>Lorem ipsum dolor sit amet</w:t>
+            </w:r>
+          </w:p>
+        </w:tc>
+      </w:tr>
+      <w:tr>
+        <w:tc>
+          <w:tcPr>
+            <w:tcW w:w="1500" w:type="dxa"/>
           </w:tcPr>
           <w:p>
             <w:r>
@@ -854,19 +855,19 @@
         </w:tc>
         <w:tc>
           <w:tcPr>
-            <w:tcW w:w="3000" w:type="dxa"/>
-          </w:tcPr>
-          <w:p>
-            <w:r>
-              <w:t>Lorem ipsum dolor sit amet</w:t>
-            </w:r>
-          </w:p>
-        </w:tc>
-      </w:tr>
-      <w:tr>
-        <w:tc>
-          <w:tcPr>
-            <w:tcW w:w="3000" w:type="dxa"/>
+            <w:tcW w:w="4500" w:type="dxa"/>
+          </w:tcPr>
+          <w:p>
+            <w:r>
+              <w:t>Lorem ipsum dolor sit amet</w:t>
+            </w:r>
+          </w:p>
+        </w:tc>
+      </w:tr>
+      <w:tr>
+        <w:tc>
+          <w:tcPr>
+            <w:tcW w:w="1500" w:type="dxa"/>
           </w:tcPr>
           <w:p>
             <w:r>
@@ -886,19 +887,19 @@
         </w:tc>
         <w:tc>
           <w:tcPr>
-            <w:tcW w:w="3000" w:type="dxa"/>
-          </w:tcPr>
-          <w:p>
-            <w:r>
-              <w:t>Lorem ipsum dolor sit amet</w:t>
-            </w:r>
-          </w:p>
-        </w:tc>
-      </w:tr>
-      <w:tr>
-        <w:tc>
-          <w:tcPr>
-            <w:tcW w:w="3000" w:type="dxa"/>
+            <w:tcW w:w="4500" w:type="dxa"/>
+          </w:tcPr>
+          <w:p>
+            <w:r>
+              <w:t>Lorem ipsum dolor sit amet</w:t>
+            </w:r>
+          </w:p>
+        </w:tc>
+      </w:tr>
+      <w:tr>
+        <w:tc>
+          <w:tcPr>
+            <w:tcW w:w="1500" w:type="dxa"/>
           </w:tcPr>
           <w:p>
             <w:r>
@@ -918,19 +919,19 @@
         </w:tc>
         <w:tc>
           <w:tcPr>
-            <w:tcW w:w="3000" w:type="dxa"/>
-          </w:tcPr>
-          <w:p>
-            <w:r>
-              <w:t>Lorem ipsum dolor sit amet</w:t>
-            </w:r>
-          </w:p>
-        </w:tc>
-      </w:tr>
-      <w:tr>
-        <w:tc>
-          <w:tcPr>
-            <w:tcW w:w="3000" w:type="dxa"/>
+            <w:tcW w:w="4500" w:type="dxa"/>
+          </w:tcPr>
+          <w:p>
+            <w:r>
+              <w:t>Lorem ipsum dolor sit amet</w:t>
+            </w:r>
+          </w:p>
+        </w:tc>
+      </w:tr>
+      <w:tr>
+        <w:tc>
+          <w:tcPr>
+            <w:tcW w:w="1500" w:type="dxa"/>
           </w:tcPr>
           <w:p>
             <w:r>
@@ -950,19 +951,19 @@
         </w:tc>
         <w:tc>
           <w:tcPr>
-            <w:tcW w:w="3000" w:type="dxa"/>
-          </w:tcPr>
-          <w:p>
-            <w:r>
-              <w:t>Lorem ipsum dolor sit amet</w:t>
-            </w:r>
-          </w:p>
-        </w:tc>
-      </w:tr>
-      <w:tr>
-        <w:tc>
-          <w:tcPr>
-            <w:tcW w:w="3000" w:type="dxa"/>
+            <w:tcW w:w="4500" w:type="dxa"/>
+          </w:tcPr>
+          <w:p>
+            <w:r>
+              <w:t>Lorem ipsum dolor sit amet</w:t>
+            </w:r>
+          </w:p>
+        </w:tc>
+      </w:tr>
+      <w:tr>
+        <w:tc>
+          <w:tcPr>
+            <w:tcW w:w="1500" w:type="dxa"/>
           </w:tcPr>
           <w:p>
             <w:r>
@@ -982,19 +983,19 @@
         </w:tc>
         <w:tc>
           <w:tcPr>
-            <w:tcW w:w="3000" w:type="dxa"/>
-          </w:tcPr>
-          <w:p>
-            <w:r>
-              <w:t>Lorem ipsum dolor sit amet</w:t>
-            </w:r>
-          </w:p>
-        </w:tc>
-      </w:tr>
-      <w:tr>
-        <w:tc>
-          <w:tcPr>
-            <w:tcW w:w="3000" w:type="dxa"/>
+            <w:tcW w:w="4500" w:type="dxa"/>
+          </w:tcPr>
+          <w:p>
+            <w:r>
+              <w:t>Lorem ipsum dolor sit amet</w:t>
+            </w:r>
+          </w:p>
+        </w:tc>
+      </w:tr>
+      <w:tr>
+        <w:tc>
+          <w:tcPr>
+            <w:tcW w:w="1500" w:type="dxa"/>
           </w:tcPr>
           <w:p>
             <w:r>
@@ -1014,19 +1015,19 @@
         </w:tc>
         <w:tc>
           <w:tcPr>
-            <w:tcW w:w="3000" w:type="dxa"/>
-          </w:tcPr>
-          <w:p>
-            <w:r>
-              <w:t>Lorem ipsum dolor sit amet</w:t>
-            </w:r>
-          </w:p>
-        </w:tc>
-      </w:tr>
-      <w:tr>
-        <w:tc>
-          <w:tcPr>
-            <w:tcW w:w="3000" w:type="dxa"/>
+            <w:tcW w:w="4500" w:type="dxa"/>
+          </w:tcPr>
+          <w:p>
+            <w:r>
+              <w:t>Lorem ipsum dolor sit amet</w:t>
+            </w:r>
+          </w:p>
+        </w:tc>
+      </w:tr>
+      <w:tr>
+        <w:tc>
+          <w:tcPr>
+            <w:tcW w:w="1500" w:type="dxa"/>
           </w:tcPr>
           <w:p>
             <w:r>
@@ -1046,19 +1047,19 @@
         </w:tc>
         <w:tc>
           <w:tcPr>
-            <w:tcW w:w="3000" w:type="dxa"/>
-          </w:tcPr>
-          <w:p>
-            <w:r>
-              <w:t>Lorem ipsum dolor sit amet</w:t>
-            </w:r>
-          </w:p>
-        </w:tc>
-      </w:tr>
-      <w:tr>
-        <w:tc>
-          <w:tcPr>
-            <w:tcW w:w="3000" w:type="dxa"/>
+            <w:tcW w:w="4500" w:type="dxa"/>
+          </w:tcPr>
+          <w:p>
+            <w:r>
+              <w:t>Lorem ipsum dolor sit amet</w:t>
+            </w:r>
+          </w:p>
+        </w:tc>
+      </w:tr>
+      <w:tr>
+        <w:tc>
+          <w:tcPr>
+            <w:tcW w:w="1500" w:type="dxa"/>
           </w:tcPr>
           <w:p>
             <w:r>
@@ -1078,19 +1079,19 @@
         </w:tc>
         <w:tc>
           <w:tcPr>
-            <w:tcW w:w="3000" w:type="dxa"/>
-          </w:tcPr>
-          <w:p>
-            <w:r>
-              <w:t>Lorem ipsum dolor sit amet</w:t>
-            </w:r>
-          </w:p>
-        </w:tc>
-      </w:tr>
-      <w:tr>
-        <w:tc>
-          <w:tcPr>
-            <w:tcW w:w="3000" w:type="dxa"/>
+            <w:tcW w:w="4500" w:type="dxa"/>
+          </w:tcPr>
+          <w:p>
+            <w:r>
+              <w:t>Lorem ipsum dolor sit amet</w:t>
+            </w:r>
+          </w:p>
+        </w:tc>
+      </w:tr>
+      <w:tr>
+        <w:tc>
+          <w:tcPr>
+            <w:tcW w:w="1500" w:type="dxa"/>
           </w:tcPr>
           <w:p>
             <w:r>
@@ -1110,19 +1111,19 @@
         </w:tc>
         <w:tc>
           <w:tcPr>
-            <w:tcW w:w="3000" w:type="dxa"/>
-          </w:tcPr>
-          <w:p>
-            <w:r>
-              <w:t>Lorem ipsum dolor sit amet</w:t>
-            </w:r>
-          </w:p>
-        </w:tc>
-      </w:tr>
-      <w:tr>
-        <w:tc>
-          <w:tcPr>
-            <w:tcW w:w="3000" w:type="dxa"/>
+            <w:tcW w:w="4500" w:type="dxa"/>
+          </w:tcPr>
+          <w:p>
+            <w:r>
+              <w:t>Lorem ipsum dolor sit amet</w:t>
+            </w:r>
+          </w:p>
+        </w:tc>
+      </w:tr>
+      <w:tr>
+        <w:tc>
+          <w:tcPr>
+            <w:tcW w:w="1500" w:type="dxa"/>
           </w:tcPr>
           <w:p>
             <w:r>
@@ -1142,19 +1143,19 @@
         </w:tc>
         <w:tc>
           <w:tcPr>
-            <w:tcW w:w="3000" w:type="dxa"/>
-          </w:tcPr>
-          <w:p>
-            <w:r>
-              <w:t>Lorem ipsum dolor sit amet</w:t>
-            </w:r>
-          </w:p>
-        </w:tc>
-      </w:tr>
-      <w:tr>
-        <w:tc>
-          <w:tcPr>
-            <w:tcW w:w="3000" w:type="dxa"/>
+            <w:tcW w:w="4500" w:type="dxa"/>
+          </w:tcPr>
+          <w:p>
+            <w:r>
+              <w:t>Lorem ipsum dolor sit amet</w:t>
+            </w:r>
+          </w:p>
+        </w:tc>
+      </w:tr>
+      <w:tr>
+        <w:tc>
+          <w:tcPr>
+            <w:tcW w:w="1500" w:type="dxa"/>
           </w:tcPr>
           <w:p>
             <w:r>
@@ -1174,19 +1175,19 @@
         </w:tc>
         <w:tc>
           <w:tcPr>
-            <w:tcW w:w="3000" w:type="dxa"/>
-          </w:tcPr>
-          <w:p>
-            <w:r>
-              <w:t>Lorem ipsum dolor sit amet</w:t>
-            </w:r>
-          </w:p>
-        </w:tc>
-      </w:tr>
-      <w:tr>
-        <w:tc>
-          <w:tcPr>
-            <w:tcW w:w="3000" w:type="dxa"/>
+            <w:tcW w:w="4500" w:type="dxa"/>
+          </w:tcPr>
+          <w:p>
+            <w:r>
+              <w:t>Lorem ipsum dolor sit amet</w:t>
+            </w:r>
+          </w:p>
+        </w:tc>
+      </w:tr>
+      <w:tr>
+        <w:tc>
+          <w:tcPr>
+            <w:tcW w:w="1500" w:type="dxa"/>
           </w:tcPr>
           <w:p>
             <w:r>
@@ -1206,19 +1207,19 @@
         </w:tc>
         <w:tc>
           <w:tcPr>
-            <w:tcW w:w="3000" w:type="dxa"/>
-          </w:tcPr>
-          <w:p>
-            <w:r>
-              <w:t>Lorem ipsum dolor sit amet</w:t>
-            </w:r>
-          </w:p>
-        </w:tc>
-      </w:tr>
-      <w:tr>
-        <w:tc>
-          <w:tcPr>
-            <w:tcW w:w="3000" w:type="dxa"/>
+            <w:tcW w:w="4500" w:type="dxa"/>
+          </w:tcPr>
+          <w:p>
+            <w:r>
+              <w:t>Lorem ipsum dolor sit amet</w:t>
+            </w:r>
+          </w:p>
+        </w:tc>
+      </w:tr>
+      <w:tr>
+        <w:tc>
+          <w:tcPr>
+            <w:tcW w:w="1500" w:type="dxa"/>
           </w:tcPr>
           <w:p>
             <w:r>
@@ -1238,19 +1239,19 @@
         </w:tc>
         <w:tc>
           <w:tcPr>
-            <w:tcW w:w="3000" w:type="dxa"/>
-          </w:tcPr>
-          <w:p>
-            <w:r>
-              <w:t>Lorem ipsum dolor sit amet</w:t>
-            </w:r>
-          </w:p>
-        </w:tc>
-      </w:tr>
-      <w:tr>
-        <w:tc>
-          <w:tcPr>
-            <w:tcW w:w="3000" w:type="dxa"/>
+            <w:tcW w:w="4500" w:type="dxa"/>
+          </w:tcPr>
+          <w:p>
+            <w:r>
+              <w:t>Lorem ipsum dolor sit amet</w:t>
+            </w:r>
+          </w:p>
+        </w:tc>
+      </w:tr>
+      <w:tr>
+        <w:tc>
+          <w:tcPr>
+            <w:tcW w:w="1500" w:type="dxa"/>
           </w:tcPr>
           <w:p>
             <w:r>
@@ -1270,19 +1271,19 @@
         </w:tc>
         <w:tc>
           <w:tcPr>
-            <w:tcW w:w="3000" w:type="dxa"/>
-          </w:tcPr>
-          <w:p>
-            <w:r>
-              <w:t>Lorem ipsum dolor sit amet</w:t>
-            </w:r>
-          </w:p>
-        </w:tc>
-      </w:tr>
-      <w:tr>
-        <w:tc>
-          <w:tcPr>
-            <w:tcW w:w="3000" w:type="dxa"/>
+            <w:tcW w:w="4500" w:type="dxa"/>
+          </w:tcPr>
+          <w:p>
+            <w:r>
+              <w:t>Lorem ipsum dolor sit amet</w:t>
+            </w:r>
+          </w:p>
+        </w:tc>
+      </w:tr>
+      <w:tr>
+        <w:tc>
+          <w:tcPr>
+            <w:tcW w:w="1500" w:type="dxa"/>
           </w:tcPr>
           <w:p>
             <w:r>
@@ -1302,19 +1303,19 @@
         </w:tc>
         <w:tc>
           <w:tcPr>
-            <w:tcW w:w="3000" w:type="dxa"/>
-          </w:tcPr>
-          <w:p>
-            <w:r>
-              <w:t>Lorem ipsum dolor sit amet</w:t>
-            </w:r>
-          </w:p>
-        </w:tc>
-      </w:tr>
-      <w:tr>
-        <w:tc>
-          <w:tcPr>
-            <w:tcW w:w="3000" w:type="dxa"/>
+            <w:tcW w:w="4500" w:type="dxa"/>
+          </w:tcPr>
+          <w:p>
+            <w:r>
+              <w:t>Lorem ipsum dolor sit amet</w:t>
+            </w:r>
+          </w:p>
+        </w:tc>
+      </w:tr>
+      <w:tr>
+        <w:tc>
+          <w:tcPr>
+            <w:tcW w:w="1500" w:type="dxa"/>
           </w:tcPr>
           <w:p>
             <w:r>
@@ -1334,19 +1335,19 @@
         </w:tc>
         <w:tc>
           <w:tcPr>
-            <w:tcW w:w="3000" w:type="dxa"/>
-          </w:tcPr>
-          <w:p>
-            <w:r>
-              <w:t>Lorem ipsum dolor sit amet</w:t>
-            </w:r>
-          </w:p>
-        </w:tc>
-      </w:tr>
-      <w:tr>
-        <w:tc>
-          <w:tcPr>
-            <w:tcW w:w="3000" w:type="dxa"/>
+            <w:tcW w:w="4500" w:type="dxa"/>
+          </w:tcPr>
+          <w:p>
+            <w:r>
+              <w:t>Lorem ipsum dolor sit amet</w:t>
+            </w:r>
+          </w:p>
+        </w:tc>
+      </w:tr>
+      <w:tr>
+        <w:tc>
+          <w:tcPr>
+            <w:tcW w:w="1500" w:type="dxa"/>
           </w:tcPr>
           <w:p>
             <w:r>
@@ -1366,19 +1367,19 @@
         </w:tc>
         <w:tc>
           <w:tcPr>
-            <w:tcW w:w="3000" w:type="dxa"/>
-          </w:tcPr>
-          <w:p>
-            <w:r>
-              <w:t>Lorem ipsum dolor sit amet</w:t>
-            </w:r>
-          </w:p>
-        </w:tc>
-      </w:tr>
-      <w:tr>
-        <w:tc>
-          <w:tcPr>
-            <w:tcW w:w="3000" w:type="dxa"/>
+            <w:tcW w:w="4500" w:type="dxa"/>
+          </w:tcPr>
+          <w:p>
+            <w:r>
+              <w:t>Lorem ipsum dolor sit amet</w:t>
+            </w:r>
+          </w:p>
+        </w:tc>
+      </w:tr>
+      <w:tr>
+        <w:tc>
+          <w:tcPr>
+            <w:tcW w:w="1500" w:type="dxa"/>
           </w:tcPr>
           <w:p>
             <w:r>
@@ -1398,19 +1399,19 @@
         </w:tc>
         <w:tc>
           <w:tcPr>
-            <w:tcW w:w="3000" w:type="dxa"/>
-          </w:tcPr>
-          <w:p>
-            <w:r>
-              <w:t>Lorem ipsum dolor sit amet</w:t>
-            </w:r>
-          </w:p>
-        </w:tc>
-      </w:tr>
-      <w:tr>
-        <w:tc>
-          <w:tcPr>
-            <w:tcW w:w="3000" w:type="dxa"/>
+            <w:tcW w:w="4500" w:type="dxa"/>
+          </w:tcPr>
+          <w:p>
+            <w:r>
+              <w:t>Lorem ipsum dolor sit amet</w:t>
+            </w:r>
+          </w:p>
+        </w:tc>
+      </w:tr>
+      <w:tr>
+        <w:tc>
+          <w:tcPr>
+            <w:tcW w:w="1500" w:type="dxa"/>
           </w:tcPr>
           <w:p>
             <w:r>
@@ -1430,19 +1431,19 @@
         </w:tc>
         <w:tc>
           <w:tcPr>
-            <w:tcW w:w="3000" w:type="dxa"/>
-          </w:tcPr>
-          <w:p>
-            <w:r>
-              <w:t>Lorem ipsum dolor sit amet</w:t>
-            </w:r>
-          </w:p>
-        </w:tc>
-      </w:tr>
-      <w:tr>
-        <w:tc>
-          <w:tcPr>
-            <w:tcW w:w="3000" w:type="dxa"/>
+            <w:tcW w:w="4500" w:type="dxa"/>
+          </w:tcPr>
+          <w:p>
+            <w:r>
+              <w:t>Lorem ipsum dolor sit amet</w:t>
+            </w:r>
+          </w:p>
+        </w:tc>
+      </w:tr>
+      <w:tr>
+        <w:tc>
+          <w:tcPr>
+            <w:tcW w:w="1500" w:type="dxa"/>
           </w:tcPr>
           <w:p>
             <w:r>
@@ -1462,19 +1463,19 @@
         </w:tc>
         <w:tc>
           <w:tcPr>
-            <w:tcW w:w="3000" w:type="dxa"/>
-          </w:tcPr>
-          <w:p>
-            <w:r>
-              <w:t>Lorem ipsum dolor sit amet</w:t>
-            </w:r>
-          </w:p>
-        </w:tc>
-      </w:tr>
-      <w:tr>
-        <w:tc>
-          <w:tcPr>
-            <w:tcW w:w="3000" w:type="dxa"/>
+            <w:tcW w:w="4500" w:type="dxa"/>
+          </w:tcPr>
+          <w:p>
+            <w:r>
+              <w:t>Lorem ipsum dolor sit amet</w:t>
+            </w:r>
+          </w:p>
+        </w:tc>
+      </w:tr>
+      <w:tr>
+        <w:tc>
+          <w:tcPr>
+            <w:tcW w:w="1500" w:type="dxa"/>
           </w:tcPr>
           <w:p>
             <w:r>
@@ -1494,19 +1495,19 @@
         </w:tc>
         <w:tc>
           <w:tcPr>
-            <w:tcW w:w="3000" w:type="dxa"/>
-          </w:tcPr>
-          <w:p>
-            <w:r>
-              <w:t>Lorem ipsum dolor sit amet</w:t>
-            </w:r>
-          </w:p>
-        </w:tc>
-      </w:tr>
-      <w:tr>
-        <w:tc>
-          <w:tcPr>
-            <w:tcW w:w="3000" w:type="dxa"/>
+            <w:tcW w:w="4500" w:type="dxa"/>
+          </w:tcPr>
+          <w:p>
+            <w:r>
+              <w:t>Lorem ipsum dolor sit amet</w:t>
+            </w:r>
+          </w:p>
+        </w:tc>
+      </w:tr>
+      <w:tr>
+        <w:tc>
+          <w:tcPr>
+            <w:tcW w:w="1500" w:type="dxa"/>
           </w:tcPr>
           <w:p>
             <w:r>
@@ -1526,19 +1527,19 @@
         </w:tc>
         <w:tc>
           <w:tcPr>
-            <w:tcW w:w="3000" w:type="dxa"/>
-          </w:tcPr>
-          <w:p>
-            <w:r>
-              <w:t>Lorem ipsum dolor sit amet</w:t>
-            </w:r>
-          </w:p>
-        </w:tc>
-      </w:tr>
-      <w:tr>
-        <w:tc>
-          <w:tcPr>
-            <w:tcW w:w="3000" w:type="dxa"/>
+            <w:tcW w:w="4500" w:type="dxa"/>
+          </w:tcPr>
+          <w:p>
+            <w:r>
+              <w:t>Lorem ipsum dolor sit amet</w:t>
+            </w:r>
+          </w:p>
+        </w:tc>
+      </w:tr>
+      <w:tr>
+        <w:tc>
+          <w:tcPr>
+            <w:tcW w:w="1500" w:type="dxa"/>
           </w:tcPr>
           <w:p>
             <w:r>
@@ -1558,19 +1559,19 @@
         </w:tc>
         <w:tc>
           <w:tcPr>
-            <w:tcW w:w="3000" w:type="dxa"/>
-          </w:tcPr>
-          <w:p>
-            <w:r>
-              <w:t>Lorem ipsum dolor sit amet</w:t>
-            </w:r>
-          </w:p>
-        </w:tc>
-      </w:tr>
-      <w:tr>
-        <w:tc>
-          <w:tcPr>
-            <w:tcW w:w="3000" w:type="dxa"/>
+            <w:tcW w:w="4500" w:type="dxa"/>
+          </w:tcPr>
+          <w:p>
+            <w:r>
+              <w:t>Lorem ipsum dolor sit amet</w:t>
+            </w:r>
+          </w:p>
+        </w:tc>
+      </w:tr>
+      <w:tr>
+        <w:tc>
+          <w:tcPr>
+            <w:tcW w:w="1500" w:type="dxa"/>
           </w:tcPr>
           <w:p>
             <w:r>
@@ -1590,19 +1591,19 @@
         </w:tc>
         <w:tc>
           <w:tcPr>
-            <w:tcW w:w="3000" w:type="dxa"/>
-          </w:tcPr>
-          <w:p>
-            <w:r>
-              <w:t>Lorem ipsum dolor sit amet</w:t>
-            </w:r>
-          </w:p>
-        </w:tc>
-      </w:tr>
-      <w:tr>
-        <w:tc>
-          <w:tcPr>
-            <w:tcW w:w="3000" w:type="dxa"/>
+            <w:tcW w:w="4500" w:type="dxa"/>
+          </w:tcPr>
+          <w:p>
+            <w:r>
+              <w:t>Lorem ipsum dolor sit amet</w:t>
+            </w:r>
+          </w:p>
+        </w:tc>
+      </w:tr>
+      <w:tr>
+        <w:tc>
+          <w:tcPr>
+            <w:tcW w:w="1500" w:type="dxa"/>
           </w:tcPr>
           <w:p>
             <w:r>
@@ -1622,19 +1623,19 @@
         </w:tc>
         <w:tc>
           <w:tcPr>
-            <w:tcW w:w="3000" w:type="dxa"/>
-          </w:tcPr>
-          <w:p>
-            <w:r>
-              <w:t>Lorem ipsum dolor sit amet</w:t>
-            </w:r>
-          </w:p>
-        </w:tc>
-      </w:tr>
-      <w:tr>
-        <w:tc>
-          <w:tcPr>
-            <w:tcW w:w="3000" w:type="dxa"/>
+            <w:tcW w:w="4500" w:type="dxa"/>
+          </w:tcPr>
+          <w:p>
+            <w:r>
+              <w:t>Lorem ipsum dolor sit amet</w:t>
+            </w:r>
+          </w:p>
+        </w:tc>
+      </w:tr>
+      <w:tr>
+        <w:tc>
+          <w:tcPr>
+            <w:tcW w:w="1500" w:type="dxa"/>
           </w:tcPr>
           <w:p>
             <w:r>
@@ -1654,19 +1655,19 @@
         </w:tc>
         <w:tc>
           <w:tcPr>
-            <w:tcW w:w="3000" w:type="dxa"/>
-          </w:tcPr>
-          <w:p>
-            <w:r>
-              <w:t>Lorem ipsum dolor sit amet</w:t>
-            </w:r>
-          </w:p>
-        </w:tc>
-      </w:tr>
-      <w:tr>
-        <w:tc>
-          <w:tcPr>
-            <w:tcW w:w="3000" w:type="dxa"/>
+            <w:tcW w:w="4500" w:type="dxa"/>
+          </w:tcPr>
+          <w:p>
+            <w:r>
+              <w:t>Lorem ipsum dolor sit amet</w:t>
+            </w:r>
+          </w:p>
+        </w:tc>
+      </w:tr>
+      <w:tr>
+        <w:tc>
+          <w:tcPr>
+            <w:tcW w:w="1500" w:type="dxa"/>
           </w:tcPr>
           <w:p>
             <w:r>
@@ -1686,19 +1687,19 @@
         </w:tc>
         <w:tc>
           <w:tcPr>
-            <w:tcW w:w="3000" w:type="dxa"/>
-          </w:tcPr>
-          <w:p>
-            <w:r>
-              <w:t>Lorem ipsum dolor sit amet</w:t>
-            </w:r>
-          </w:p>
-        </w:tc>
-      </w:tr>
-      <w:tr>
-        <w:tc>
-          <w:tcPr>
-            <w:tcW w:w="3000" w:type="dxa"/>
+            <w:tcW w:w="4500" w:type="dxa"/>
+          </w:tcPr>
+          <w:p>
+            <w:r>
+              <w:t>Lorem ipsum dolor sit amet</w:t>
+            </w:r>
+          </w:p>
+        </w:tc>
+      </w:tr>
+      <w:tr>
+        <w:tc>
+          <w:tcPr>
+            <w:tcW w:w="1500" w:type="dxa"/>
           </w:tcPr>
           <w:p>
             <w:r>
@@ -1718,19 +1719,19 @@
         </w:tc>
         <w:tc>
           <w:tcPr>
-            <w:tcW w:w="3000" w:type="dxa"/>
-          </w:tcPr>
-          <w:p>
-            <w:r>
-              <w:t>Lorem ipsum dolor sit amet</w:t>
-            </w:r>
-          </w:p>
-        </w:tc>
-      </w:tr>
-      <w:tr>
-        <w:tc>
-          <w:tcPr>
-            <w:tcW w:w="3000" w:type="dxa"/>
+            <w:tcW w:w="4500" w:type="dxa"/>
+          </w:tcPr>
+          <w:p>
+            <w:r>
+              <w:t>Lorem ipsum dolor sit amet</w:t>
+            </w:r>
+          </w:p>
+        </w:tc>
+      </w:tr>
+      <w:tr>
+        <w:tc>
+          <w:tcPr>
+            <w:tcW w:w="1500" w:type="dxa"/>
           </w:tcPr>
           <w:p>
             <w:r>
@@ -1750,19 +1751,19 @@
         </w:tc>
         <w:tc>
           <w:tcPr>
-            <w:tcW w:w="3000" w:type="dxa"/>
-          </w:tcPr>
-          <w:p>
-            <w:r>
-              <w:t>Lorem ipsum dolor sit amet</w:t>
-            </w:r>
-          </w:p>
-        </w:tc>
-      </w:tr>
-      <w:tr>
-        <w:tc>
-          <w:tcPr>
-            <w:tcW w:w="3000" w:type="dxa"/>
+            <w:tcW w:w="4500" w:type="dxa"/>
+          </w:tcPr>
+          <w:p>
+            <w:r>
+              <w:t>Lorem ipsum dolor sit amet</w:t>
+            </w:r>
+          </w:p>
+        </w:tc>
+      </w:tr>
+      <w:tr>
+        <w:tc>
+          <w:tcPr>
+            <w:tcW w:w="1500" w:type="dxa"/>
           </w:tcPr>
           <w:p>
             <w:r>
@@ -1782,19 +1783,19 @@
         </w:tc>
         <w:tc>
           <w:tcPr>
-            <w:tcW w:w="3000" w:type="dxa"/>
-          </w:tcPr>
-          <w:p>
-            <w:r>
-              <w:t>Lorem ipsum dolor sit amet</w:t>
-            </w:r>
-          </w:p>
-        </w:tc>
-      </w:tr>
-      <w:tr>
-        <w:tc>
-          <w:tcPr>
-            <w:tcW w:w="3000" w:type="dxa"/>
+            <w:tcW w:w="4500" w:type="dxa"/>
+          </w:tcPr>
+          <w:p>
+            <w:r>
+              <w:t>Lorem ipsum dolor sit amet</w:t>
+            </w:r>
+          </w:p>
+        </w:tc>
+      </w:tr>
+      <w:tr>
+        <w:tc>
+          <w:tcPr>
+            <w:tcW w:w="1500" w:type="dxa"/>
           </w:tcPr>
           <w:p>
             <w:r>
@@ -1814,19 +1815,19 @@
         </w:tc>
         <w:tc>
           <w:tcPr>
-            <w:tcW w:w="3000" w:type="dxa"/>
-          </w:tcPr>
-          <w:p>
-            <w:r>
-              <w:t>Lorem ipsum dolor sit amet</w:t>
-            </w:r>
-          </w:p>
-        </w:tc>
-      </w:tr>
-      <w:tr>
-        <w:tc>
-          <w:tcPr>
-            <w:tcW w:w="3000" w:type="dxa"/>
+            <w:tcW w:w="4500" w:type="dxa"/>
+          </w:tcPr>
+          <w:p>
+            <w:r>
+              <w:t>Lorem ipsum dolor sit amet</w:t>
+            </w:r>
+          </w:p>
+        </w:tc>
+      </w:tr>
+      <w:tr>
+        <w:tc>
+          <w:tcPr>
+            <w:tcW w:w="1500" w:type="dxa"/>
           </w:tcPr>
           <w:p>
             <w:r>
@@ -1846,19 +1847,19 @@
         </w:tc>
         <w:tc>
           <w:tcPr>
-            <w:tcW w:w="3000" w:type="dxa"/>
-          </w:tcPr>
-          <w:p>
-            <w:r>
-              <w:t>Lorem ipsum dolor sit amet</w:t>
-            </w:r>
-          </w:p>
-        </w:tc>
-      </w:tr>
-      <w:tr>
-        <w:tc>
-          <w:tcPr>
-            <w:tcW w:w="3000" w:type="dxa"/>
+            <w:tcW w:w="4500" w:type="dxa"/>
+          </w:tcPr>
+          <w:p>
+            <w:r>
+              <w:t>Lorem ipsum dolor sit amet</w:t>
+            </w:r>
+          </w:p>
+        </w:tc>
+      </w:tr>
+      <w:tr>
+        <w:tc>
+          <w:tcPr>
+            <w:tcW w:w="1500" w:type="dxa"/>
           </w:tcPr>
           <w:p>
             <w:r>
@@ -1878,19 +1879,19 @@
         </w:tc>
         <w:tc>
           <w:tcPr>
-            <w:tcW w:w="3000" w:type="dxa"/>
-          </w:tcPr>
-          <w:p>
-            <w:r>
-              <w:t>Lorem ipsum dolor sit amet</w:t>
-            </w:r>
-          </w:p>
-        </w:tc>
-      </w:tr>
-      <w:tr>
-        <w:tc>
-          <w:tcPr>
-            <w:tcW w:w="3000" w:type="dxa"/>
+            <w:tcW w:w="4500" w:type="dxa"/>
+          </w:tcPr>
+          <w:p>
+            <w:r>
+              <w:t>Lorem ipsum dolor sit amet</w:t>
+            </w:r>
+          </w:p>
+        </w:tc>
+      </w:tr>
+      <w:tr>
+        <w:tc>
+          <w:tcPr>
+            <w:tcW w:w="1500" w:type="dxa"/>
           </w:tcPr>
           <w:p>
             <w:r>
@@ -1910,19 +1911,19 @@
         </w:tc>
         <w:tc>
           <w:tcPr>
-            <w:tcW w:w="3000" w:type="dxa"/>
-          </w:tcPr>
-          <w:p>
-            <w:r>
-              <w:t>Lorem ipsum dolor sit amet</w:t>
-            </w:r>
-          </w:p>
-        </w:tc>
-      </w:tr>
-      <w:tr>
-        <w:tc>
-          <w:tcPr>
-            <w:tcW w:w="3000" w:type="dxa"/>
+            <w:tcW w:w="4500" w:type="dxa"/>
+          </w:tcPr>
+          <w:p>
+            <w:r>
+              <w:t>Lorem ipsum dolor sit amet</w:t>
+            </w:r>
+          </w:p>
+        </w:tc>
+      </w:tr>
+      <w:tr>
+        <w:tc>
+          <w:tcPr>
+            <w:tcW w:w="1500" w:type="dxa"/>
           </w:tcPr>
           <w:p>
             <w:r>
@@ -1942,19 +1943,19 @@
         </w:tc>
         <w:tc>
           <w:tcPr>
-            <w:tcW w:w="3000" w:type="dxa"/>
-          </w:tcPr>
-          <w:p>
-            <w:r>
-              <w:t>Lorem ipsum dolor sit amet</w:t>
-            </w:r>
-          </w:p>
-        </w:tc>
-      </w:tr>
-      <w:tr>
-        <w:tc>
-          <w:tcPr>
-            <w:tcW w:w="3000" w:type="dxa"/>
+            <w:tcW w:w="4500" w:type="dxa"/>
+          </w:tcPr>
+          <w:p>
+            <w:r>
+              <w:t>Lorem ipsum dolor sit amet</w:t>
+            </w:r>
+          </w:p>
+        </w:tc>
+      </w:tr>
+      <w:tr>
+        <w:tc>
+          <w:tcPr>
+            <w:tcW w:w="1500" w:type="dxa"/>
           </w:tcPr>
           <w:p>
             <w:r>
@@ -1974,7 +1975,7 @@
         </w:tc>
         <w:tc>
           <w:tcPr>
-            <w:tcW w:w="3000" w:type="dxa"/>
+            <w:tcW w:w="4500" w:type="dxa"/>
           </w:tcPr>
           <w:p>
             <w:r>

</xml_diff>